<commit_message>
Logo: tahta PNG'sinde köşe mührü ve derskutusu.com; günlük plan docx üst bilgisinde mühür, DERS KUTUSU ve ders adı; stil sürümü v=27
Co-Authored-By: Claude Opus 5.5 <noreply@anthropic.com>
</commit_message>
<xml_diff>
--- a/public/dosyalar/gunluk-plan/11-sinif-dinler-tarihi-gunluk-plan-2026-2027.docx
+++ b/public/dosyalar/gunluk-plan/11-sinif-dinler-tarihi-gunluk-plan-2026-2027.docx
@@ -34754,9 +34754,10 @@
       </w:tr>
     </w:tbl>
     <w:sectPr>
-      <w:footerReference w:type="default" r:id="rId9"/>
+      <w:headerReference w:type="default" r:id="rId9"/>
+      <w:footerReference w:type="default" r:id="rId10"/>
       <w:pgSz w:w="11906" w:h="16838"/>
-      <w:pgMar w:top="737" w:right="850" w:bottom="737" w:left="850" w:header="720" w:footer="720" w:gutter="0"/>
+      <w:pgMar w:top="1417" w:right="850" w:bottom="737" w:left="850" w:header="340" w:footer="720" w:gutter="0"/>
       <w:cols w:space="720"/>
       <w:docGrid w:linePitch="360"/>
     </w:sectPr>
@@ -34779,6 +34780,82 @@
     </w:r>
   </w:p>
 </w:ftr>
+</file>
+
+<file path=word/header1.xml><?xml version="1.0" encoding="utf-8"?>
+<w:hdr xmlns:m="http://schemas.openxmlformats.org/officeDocument/2006/math" xmlns:mc="http://schemas.openxmlformats.org/markup-compatibility/2006" xmlns:mo="http://schemas.microsoft.com/office/mac/office/2008/main" xmlns:mv="urn:schemas-microsoft-com:mac:vml" xmlns:o="urn:schemas-microsoft-com:office:office" xmlns:r="http://schemas.openxmlformats.org/officeDocument/2006/relationships" xmlns:v="urn:schemas-microsoft-com:vml" xmlns:w10="urn:schemas-microsoft-com:office:word" xmlns:w14="http://schemas.microsoft.com/office/word/2010/wordml" xmlns:w="http://schemas.openxmlformats.org/wordprocessingml/2006/main" xmlns:wne="http://schemas.microsoft.com/office/word/2006/wordml" xmlns:wp14="http://schemas.microsoft.com/office/word/2010/wordprocessingDrawing" xmlns:wp="http://schemas.openxmlformats.org/drawingml/2006/wordprocessingDrawing" xmlns:wpc="http://schemas.microsoft.com/office/word/2010/wordprocessingCanvas" xmlns:wpg="http://schemas.microsoft.com/office/word/2010/wordprocessingGroup" xmlns:wpi="http://schemas.microsoft.com/office/word/2010/wordprocessingInk" xmlns:wps="http://schemas.microsoft.com/office/word/2010/wordprocessingShape" mc:Ignorable="w14 wp14">
+  <w:p>
+    <w:pPr>
+      <w:pStyle w:val="Header"/>
+      <w:pBdr>
+        <w:bottom w:val="single" w:sz="8" w:space="4" w:color="0B2257"/>
+      </w:pBdr>
+      <w:tabs>
+        <w:tab w:pos="4680" w:val="clear"/>
+        <w:tab w:pos="9360" w:val="clear"/>
+        <w:tab w:pos="10205" w:val="right"/>
+      </w:tabs>
+      <w:spacing w:after="0"/>
+    </w:pPr>
+    <w:r>
+      <w:drawing>
+        <wp:inline xmlns:a="http://schemas.openxmlformats.org/drawingml/2006/main" xmlns:pic="http://schemas.openxmlformats.org/drawingml/2006/picture">
+          <wp:extent cx="378000" cy="378000"/>
+          <wp:docPr id="1" name="Picture 1"/>
+          <wp:cNvGraphicFramePr>
+            <a:graphicFrameLocks noChangeAspect="1"/>
+          </wp:cNvGraphicFramePr>
+          <a:graphic>
+            <a:graphicData uri="http://schemas.openxmlformats.org/drawingml/2006/picture">
+              <pic:pic>
+                <pic:nvPicPr>
+                  <pic:cNvPr id="0" name="simge-192.png"/>
+                  <pic:cNvPicPr/>
+                </pic:nvPicPr>
+                <pic:blipFill>
+                  <a:blip r:embed="rId1"/>
+                  <a:stretch>
+                    <a:fillRect/>
+                  </a:stretch>
+                </pic:blipFill>
+                <pic:spPr>
+                  <a:xfrm>
+                    <a:off x="0" y="0"/>
+                    <a:ext cx="378000" cy="378000"/>
+                  </a:xfrm>
+                  <a:prstGeom prst="rect"/>
+                </pic:spPr>
+              </pic:pic>
+            </a:graphicData>
+          </a:graphic>
+        </wp:inline>
+      </w:drawing>
+    </w:r>
+    <w:r>
+      <w:rPr>
+        <w:b/>
+        <w:color w:val="0B2257"/>
+        <w:sz w:val="22"/>
+      </w:rPr>
+      <w:t xml:space="preserve">  DERS KUTUSU</w:t>
+    </w:r>
+    <w:r>
+      <w:rPr>
+        <w:color w:val="5B6479"/>
+        <w:sz w:val="17"/>
+      </w:rPr>
+      <w:t xml:space="preserve">  derskutusu.com</w:t>
+    </w:r>
+    <w:r>
+      <w:rPr>
+        <w:color w:val="5B6479"/>
+        <w:sz w:val="17"/>
+      </w:rPr>
+      <w:tab/>
+      <w:t>11. Sınıf Dinler Tarihi · Günlük plan · 2026-2027</w:t>
+    </w:r>
+  </w:p>
+</w:hdr>
 </file>
 
 <file path=word/numbering.xml><?xml version="1.0" encoding="utf-8"?>

</xml_diff>

<commit_message>
Günlük planlarda Excel formülü yerine gerçek metin
Üç dersin günlük planında (11 Dinler Tarihi, 12 Temel Dinî Bilgiler İslam 2,
12 Türk Dili ve Edebiyatı) yıllık plan Excel'indeki hücre bağlantıları
çözülmeden yazılmıştı: Konu, Ünite ve Kazanım yerinde "=$G$3",
"='[1]12.SINIF TDE'!$F$20" gibi formüller görünüyordu. Ders ağacında da
"=$d$9" gibi sahte üniteler oluşmuştu.
- Üretici artık Excel'in sakladığı sonucu, dış dosya bağlantısının önbelleğini
  ya da aynı sayfadaki hücreyi okuyor; çözülemeyen formülü boş sayıyor.
- 3 Word belgesi, 3 plan verisi ve 2 ders ağacı yeniden üretildi; öteki
  98 plan değişmedi.

Co-Authored-By: Claude Opus 5.5 <noreply@anthropic.com>
</commit_message>
<xml_diff>
--- a/public/dosyalar/gunluk-plan/11-sinif-dinler-tarihi-gunluk-plan-2026-2027.docx
+++ b/public/dosyalar/gunluk-plan/11-sinif-dinler-tarihi-gunluk-plan-2026-2027.docx
@@ -7187,7 +7187,7 @@
                 <w:b w:val="0"/>
                 <w:sz w:val="19"/>
               </w:rPr>
-              <w:t>=$D$9</w:t>
+              <w:t>2. İSLAMİYET</w:t>
             </w:r>
           </w:p>
         </w:tc>
@@ -7226,7 +7226,7 @@
                 <w:b w:val="0"/>
                 <w:sz w:val="19"/>
               </w:rPr>
-              <w:t>=$E$9</w:t>
+              <w:t>1. İslamiyet'in Tarihçesi</w:t>
             </w:r>
           </w:p>
         </w:tc>
@@ -8154,7 +8154,7 @@
                 <w:b w:val="0"/>
                 <w:sz w:val="19"/>
               </w:rPr>
-              <w:t>=$D$9</w:t>
+              <w:t>2. İSLAMİYET</w:t>
             </w:r>
           </w:p>
         </w:tc>
@@ -9172,7 +9172,7 @@
                 <w:b w:val="0"/>
                 <w:sz w:val="19"/>
               </w:rPr>
-              <w:t>=$D$11</w:t>
+              <w:t>2. İSLAMİYET</w:t>
             </w:r>
           </w:p>
         </w:tc>
@@ -10190,7 +10190,7 @@
                 <w:b w:val="0"/>
                 <w:sz w:val="19"/>
               </w:rPr>
-              <w:t>=$D$11</w:t>
+              <w:t>2. İSLAMİYET</w:t>
             </w:r>
           </w:p>
         </w:tc>
@@ -11169,7 +11169,7 @@
                 <w:b w:val="0"/>
                 <w:sz w:val="19"/>
               </w:rPr>
-              <w:t>=$D$11</w:t>
+              <w:t>2. İSLAMİYET</w:t>
             </w:r>
           </w:p>
         </w:tc>

</xml_diff>